<commit_message>
docs(paper): abstract — fórmula v2 aditiva como evidência da shadow discipline (aprovado Toto)
Pain segue first-class; evolução multiplicativa→aditiva vira argumento
a favor da tese (shadow telemetry detectou dead-range e forçou v2).
Fecha vulnerabilidade de review (abstract contradizia §5.2).

Co-Authored-By: Claude Opus 4.8 (1M context) <noreply@anthropic.com>
</commit_message>
<xml_diff>
--- a/paper/paper-tecnico-nox-mem.docx
+++ b/paper/paper-tecnico-nox-mem.docx
@@ -120,22 +120,7 @@
         <w:t xml:space="preserve">pain-weighted hybrid memory with shadow discipline — yours by design</w:t>
       </w:r>
       <w:r>
-        <w:t xml:space="preserve">. Every retrieval and retention decision is governed by a</w:t>
-      </w:r>
-      <w:r>
-        <w:t xml:space="preserve"> </w:t>
-      </w:r>
-      <w:r>
-        <w:rPr>
-          <w:rStyle w:val="VerbatimChar"/>
-        </w:rPr>
-        <w:t xml:space="preserve">salience = recency × pain × importance</w:t>
-      </w:r>
-      <w:r>
-        <w:t xml:space="preserve"> </w:t>
-      </w:r>
-      <w:r>
-        <w:t xml:space="preserve">formula (where</w:t>
+        <w:t xml:space="preserve">. Every retrieval and retention decision is governed by an evidence-weighted salience formula in which</w:t>
       </w:r>
       <w:r>
         <w:t xml:space="preserve"> </w:t>
@@ -151,7 +136,7 @@
         <w:t xml:space="preserve"> </w:t>
       </w:r>
       <w:r>
-        <w:t xml:space="preserve">is an operator-assigned severity in [0.1, 1.0], persisted on every chunk), and every ranking change is gated by a mandatory shadow-mode telemetry phase before activation in production. Compared to existing memory systems (mem0, Letta, Zep, EverOS, LightRAG, and MeMo), nox-mem offers several advantages:</w:t>
+        <w:t xml:space="preserve">— an operator-assigned severity in [0.1, 1.0], persisted on every chunk — is a first-class signal; the formula itself evolved from multiplicative to additive form through the system’s own shadow-mode telemetry (§5.2), and every ranking change is gated by a mandatory shadow phase before production activation. Compared to existing memory systems (mem0, Letta, Zep, EverOS, LightRAG, and MeMo), nox-mem offers several advantages:</w:t>
       </w:r>
       <w:r>
         <w:t xml:space="preserve"> </w:t>

</xml_diff>